<commit_message>
Replaced the pythonbackend project with a new project called Secure Financial Management API.
</commit_message>
<xml_diff>
--- a/John Okutachi Resume.docx
+++ b/John Okutachi Resume.docx
@@ -646,6 +646,11 @@
     <w:p>
       <w:pPr>
         <w:spacing w:before="60" w:after="30"/>
+        <w:rPr>
+          <w:rFonts w:ascii="Calibri" w:hAnsi="Calibri" w:eastAsia="Calibri" w:cs="Calibri"/>
+          <w:sz w:val="21"/>
+          <w:szCs w:val="21"/>
+        </w:rPr>
       </w:pPr>
       <w:r>
         <w:rPr>
@@ -679,7 +684,7 @@
           <w:sz w:val="21"/>
           <w:szCs w:val="21"/>
         </w:rPr>
-        <w:instrText xml:space="preserve"> HYPERLINK "https://github.com/Kage-No-Shinobi/flask-expense-tracker-api.git" </w:instrText>
+        <w:instrText xml:space="preserve"> HYPERLINK "https://github.com/Kage-No-Shinobi/Secure-Financial-Management-Api" </w:instrText>
       </w:r>
       <w:r>
         <w:rPr>
@@ -705,51 +710,89 @@
           <w:szCs w:val="21"/>
         </w:rPr>
         <w:fldChar w:fldCharType="end"/>
-      </w:r>
-    </w:p>
-    <w:p>
-      <w:pPr>
-        <w:pStyle w:val="16"/>
-        <w:numPr>
-          <w:ilvl w:val="0"/>
-          <w:numId w:val="1"/>
-        </w:numPr>
-        <w:spacing w:after="40"/>
-      </w:pPr>
-      <w:r>
-        <w:rPr>
-          <w:rFonts w:ascii="Calibri" w:hAnsi="Calibri" w:eastAsia="Calibri" w:cs="Calibri"/>
-          <w:sz w:val="21"/>
-          <w:szCs w:val="21"/>
-        </w:rPr>
-        <w:t>Built Flask backend applications with REST APIs and database integratio</w:t>
       </w:r>
       <w:bookmarkStart w:id="0" w:name="_GoBack"/>
       <w:bookmarkEnd w:id="0"/>
-      <w:r>
-        <w:rPr>
-          <w:rFonts w:ascii="Calibri" w:hAnsi="Calibri" w:eastAsia="Calibri" w:cs="Calibri"/>
-          <w:sz w:val="21"/>
-          <w:szCs w:val="21"/>
-        </w:rPr>
-        <w:t>n, including debugging and environment/package management.</w:t>
-      </w:r>
-    </w:p>
-    <w:p>
-      <w:pPr>
-        <w:pStyle w:val="16"/>
-        <w:numPr>
-          <w:ilvl w:val="0"/>
-          <w:numId w:val="1"/>
-        </w:numPr>
-        <w:spacing w:after="40"/>
-      </w:pPr>
-      <w:r>
-        <w:rPr>
-          <w:rFonts w:hint="default" w:cs="Helvetica Neue Regular" w:asciiTheme="minorAscii" w:hAnsiTheme="minorAscii"/>
-          <w:lang w:val="en-US"/>
-        </w:rPr>
-        <w:t>A small REST API for recording personal income and expenses,filtering transactions and producing monthly summary.</w:t>
+    </w:p>
+    <w:p>
+      <w:pPr>
+        <w:spacing w:before="60" w:after="30"/>
+        <w:rPr>
+          <w:rFonts w:hint="default" w:ascii="Calibri" w:hAnsi="Calibri" w:eastAsia="Calibri" w:cs="Calibri"/>
+          <w:sz w:val="21"/>
+          <w:szCs w:val="21"/>
+        </w:rPr>
+      </w:pPr>
+      <w:r>
+        <w:rPr>
+          <w:rFonts w:hint="default" w:ascii="Calibri" w:hAnsi="Calibri" w:eastAsia="Calibri" w:cs="Calibri"/>
+          <w:sz w:val="21"/>
+          <w:szCs w:val="21"/>
+        </w:rPr>
+        <w:t>•⁠Built a financial management REST API supporting transactions, transfers, budgets, and account management.</w:t>
+      </w:r>
+    </w:p>
+    <w:p>
+      <w:pPr>
+        <w:pBdr>
+          <w:bottom w:val="single" w:color="1F3864" w:sz="6" w:space="2"/>
+        </w:pBdr>
+        <w:spacing w:before="200" w:after="80"/>
+        <w:rPr>
+          <w:rFonts w:hint="default" w:ascii="Calibri" w:hAnsi="Calibri" w:eastAsia="Calibri" w:cs="Calibri"/>
+          <w:sz w:val="21"/>
+          <w:szCs w:val="21"/>
+        </w:rPr>
+      </w:pPr>
+      <w:r>
+        <w:rPr>
+          <w:rFonts w:hint="default" w:ascii="Calibri" w:hAnsi="Calibri" w:eastAsia="Calibri" w:cs="Calibri"/>
+          <w:sz w:val="21"/>
+          <w:szCs w:val="21"/>
+        </w:rPr>
+        <w:t>•⁠Implemented JWT authentication, 2FA, role-based permissions, and audit logging.</w:t>
+      </w:r>
+    </w:p>
+    <w:p>
+      <w:pPr>
+        <w:pBdr>
+          <w:bottom w:val="single" w:color="1F3864" w:sz="6" w:space="2"/>
+        </w:pBdr>
+        <w:spacing w:before="200" w:after="80"/>
+        <w:rPr>
+          <w:rFonts w:hint="default" w:ascii="Calibri" w:hAnsi="Calibri" w:eastAsia="Calibri" w:cs="Calibri"/>
+          <w:sz w:val="21"/>
+          <w:szCs w:val="21"/>
+        </w:rPr>
+      </w:pPr>
+      <w:r>
+        <w:rPr>
+          <w:rFonts w:hint="default" w:ascii="Calibri" w:hAnsi="Calibri" w:eastAsia="Calibri" w:cs="Calibri"/>
+          <w:sz w:val="21"/>
+          <w:szCs w:val="21"/>
+        </w:rPr>
+        <w:t>•⁠Used PostgreSQL atomic transactions and row locking to maintain financial data integrity.</w:t>
+      </w:r>
+    </w:p>
+    <w:p>
+      <w:pPr>
+        <w:pBdr>
+          <w:bottom w:val="single" w:color="1F3864" w:sz="6" w:space="2"/>
+        </w:pBdr>
+        <w:spacing w:before="200" w:after="80"/>
+        <w:rPr>
+          <w:rFonts w:hint="default" w:ascii="Calibri" w:hAnsi="Calibri" w:eastAsia="Calibri" w:cs="Calibri"/>
+          <w:sz w:val="21"/>
+          <w:szCs w:val="21"/>
+        </w:rPr>
+      </w:pPr>
+      <w:r>
+        <w:rPr>
+          <w:rFonts w:hint="default" w:ascii="Calibri" w:hAnsi="Calibri" w:eastAsia="Calibri" w:cs="Calibri"/>
+          <w:sz w:val="21"/>
+          <w:szCs w:val="21"/>
+        </w:rPr>
+        <w:t>•⁠Containerized the application and configured GitHub Actions for automated testing and CI.</w:t>
       </w:r>
     </w:p>
     <w:p>
@@ -795,7 +838,24 @@
           <w:sz w:val="21"/>
           <w:szCs w:val="21"/>
         </w:rPr>
-        <w:t xml:space="preserve"> (in progress, 300 level)  |  </w:t>
+        <w:t xml:space="preserve"> (in progress, </w:t>
+      </w:r>
+      <w:r>
+        <w:rPr>
+          <w:rFonts w:hint="default" w:ascii="Calibri" w:hAnsi="Calibri" w:eastAsia="Calibri" w:cs="Calibri"/>
+          <w:sz w:val="21"/>
+          <w:szCs w:val="21"/>
+          <w:lang w:val="en-US"/>
+        </w:rPr>
+        <w:t>4</w:t>
+      </w:r>
+      <w:r>
+        <w:rPr>
+          <w:rFonts w:ascii="Calibri" w:hAnsi="Calibri" w:eastAsia="Calibri" w:cs="Calibri"/>
+          <w:sz w:val="21"/>
+          <w:szCs w:val="21"/>
+        </w:rPr>
+        <w:t xml:space="preserve">00 level)  |  </w:t>
       </w:r>
       <w:r>
         <w:rPr>

</xml_diff>